<commit_message>
Update paper title page
</commit_message>
<xml_diff>
--- a/paper/CROSS-COUNTRY_SATELLITE-BASED_ALLOCATION_revised.docx
+++ b/paper/CROSS-COUNTRY_SATELLITE-BASED_ALLOCATION_revised.docx
@@ -38,62 +38,6 @@
     <w:p>
       <w:pPr>
         <w:spacing w:line="276" w:lineRule="auto"/>
-        <w:jc w:val="center"/>
-        <w:rPr>
-          <w:b/>
-          <w:sz w:val="32"/>
-          <w:szCs w:val="32"/>
-        </w:rPr>
-      </w:pPr>
-    </w:p>
-    <w:p>
-      <w:pPr>
-        <w:spacing w:line="276" w:lineRule="auto"/>
-        <w:jc w:val="center"/>
-        <w:rPr>
-          <w:b/>
-          <w:sz w:val="32"/>
-          <w:szCs w:val="32"/>
-        </w:rPr>
-      </w:pPr>
-    </w:p>
-    <w:p>
-      <w:pPr>
-        <w:spacing w:line="276" w:lineRule="auto"/>
-        <w:jc w:val="center"/>
-        <w:rPr>
-          <w:b/>
-          <w:sz w:val="32"/>
-          <w:szCs w:val="32"/>
-        </w:rPr>
-      </w:pPr>
-    </w:p>
-    <w:p>
-      <w:pPr>
-        <w:spacing w:line="276" w:lineRule="auto"/>
-        <w:jc w:val="center"/>
-        <w:rPr>
-          <w:b/>
-          <w:sz w:val="32"/>
-          <w:szCs w:val="32"/>
-        </w:rPr>
-      </w:pPr>
-    </w:p>
-    <w:p>
-      <w:pPr>
-        <w:spacing w:line="276" w:lineRule="auto"/>
-        <w:jc w:val="center"/>
-        <w:rPr>
-          <w:b/>
-          <w:sz w:val="32"/>
-          <w:szCs w:val="32"/>
-        </w:rPr>
-      </w:pPr>
-    </w:p>
-    <w:p>
-      <w:pPr>
-        <w:spacing w:line="276" w:lineRule="auto"/>
-        <w:jc w:val="center"/>
         <w:rPr>
           <w:b/>
           <w:sz w:val="32"/>
@@ -118,7 +62,7 @@
           <w:sz w:val="32"/>
           <w:szCs w:val="32"/>
         </w:rPr>
-        <w:t>CROSS-COUNTRY SATELLITE-BASED ALLOCATION OF SUBNATIONAL ELECTRICITY CONSUMPTION: A FIVE-COUNTRY CALIBRATION STUDY</w:t>
+        <w:t>Cross-Country Satellite-Based Allocation of Subnational Electricity Consumption: A Five-Country Calibration Study</w:t>
       </w:r>
     </w:p>
     <w:p>
@@ -128,8 +72,17 @@
           <w:ilvl w:val="0"/>
           <w:numId w:val="0"/>
         </w:numPr>
-      </w:pPr>
-    </w:p>
+        <w:rPr>
+          <w:rFonts w:eastAsiaTheme="minorHAnsi" w:cstheme="minorBidi"/>
+          <w:b w:val="0"/>
+          <w:bCs/>
+          <w:sz w:val="32"/>
+          <w:szCs w:val="32"/>
+        </w:rPr>
+      </w:pPr>
+    </w:p>
+    <w:p/>
+    <w:p/>
     <w:p>
       <w:pPr>
         <w:pStyle w:val="Heading2"/>
@@ -137,8 +90,41 @@
           <w:ilvl w:val="0"/>
           <w:numId w:val="0"/>
         </w:numPr>
-      </w:pPr>
-    </w:p>
+        <w:spacing w:line="276" w:lineRule="auto"/>
+        <w:jc w:val="center"/>
+        <w:rPr>
+          <w:rFonts w:eastAsiaTheme="minorHAnsi" w:cstheme="minorBidi"/>
+          <w:b w:val="0"/>
+          <w:bCs/>
+          <w:sz w:val="24"/>
+          <w:szCs w:val="24"/>
+        </w:rPr>
+      </w:pPr>
+      <w:r>
+        <w:rPr>
+          <w:rFonts w:eastAsiaTheme="minorHAnsi" w:cstheme="minorBidi"/>
+          <w:b w:val="0"/>
+          <w:bCs/>
+          <w:sz w:val="32"/>
+          <w:szCs w:val="32"/>
+        </w:rPr>
+        <w:t>Ayokunle Owolabi</w:t>
+      </w:r>
+      <w:r>
+        <w:rPr>
+          <w:rFonts w:eastAsiaTheme="minorHAnsi" w:cstheme="minorBidi"/>
+          <w:b w:val="0"/>
+          <w:bCs/>
+          <w:sz w:val="24"/>
+          <w:szCs w:val="24"/>
+          <w:vertAlign w:val="superscript"/>
+        </w:rPr>
+        <w:t>1</w:t>
+      </w:r>
+    </w:p>
+    <w:p/>
+    <w:p/>
+    <w:p/>
     <w:p>
       <w:pPr>
         <w:pStyle w:val="Heading2"/>
@@ -146,38 +132,62 @@
           <w:ilvl w:val="0"/>
           <w:numId w:val="0"/>
         </w:numPr>
-      </w:pPr>
-    </w:p>
-    <w:p>
-      <w:pPr>
-        <w:pStyle w:val="Heading2"/>
-        <w:numPr>
-          <w:ilvl w:val="0"/>
-          <w:numId w:val="0"/>
-        </w:numPr>
-      </w:pPr>
-    </w:p>
-    <w:p>
-      <w:pPr>
-        <w:pStyle w:val="Heading2"/>
-        <w:numPr>
-          <w:ilvl w:val="0"/>
-          <w:numId w:val="0"/>
-        </w:numPr>
-      </w:pPr>
-    </w:p>
-    <w:p>
-      <w:pPr>
-        <w:pStyle w:val="Heading2"/>
-        <w:numPr>
-          <w:ilvl w:val="0"/>
-          <w:numId w:val="0"/>
-        </w:numPr>
-      </w:pPr>
+        <w:spacing w:line="276" w:lineRule="auto"/>
+        <w:jc w:val="center"/>
+        <w:rPr>
+          <w:rFonts w:eastAsiaTheme="minorHAnsi" w:cstheme="minorBidi"/>
+          <w:b w:val="0"/>
+          <w:bCs/>
+          <w:sz w:val="32"/>
+          <w:szCs w:val="32"/>
+        </w:rPr>
+      </w:pPr>
+      <w:r>
+        <w:rPr>
+          <w:rFonts w:eastAsiaTheme="minorHAnsi" w:cstheme="minorBidi"/>
+          <w:b w:val="0"/>
+          <w:bCs/>
+          <w:sz w:val="32"/>
+          <w:szCs w:val="32"/>
+        </w:rPr>
+        <w:t>September 2026</w:t>
+      </w:r>
     </w:p>
     <w:p/>
     <w:p/>
     <w:p/>
+    <w:p/>
+    <w:p>
+      <w:pPr>
+        <w:jc w:val="center"/>
+      </w:pPr>
+      <w:r>
+        <w:rPr>
+          <w:vertAlign w:val="superscript"/>
+        </w:rPr>
+        <w:t>1</w:t>
+      </w:r>
+      <w:r>
+        <w:t xml:space="preserve">Independent researcher. This paper originated as part of Rete, an open-source initiative developing tools to model the relationship between electricity demand and supply in infrastructure-constrained markets, and is intended to serve as a methodological foundation for that project. The views, methods, and any errors in this paper are the author's own. Correspondence: </w:t>
+      </w:r>
+      <w:r>
+        <w:t>kunleowolabi77@gmail.com</w:t>
+      </w:r>
+      <w:r>
+        <w:t xml:space="preserve">. Code and data available at: </w:t>
+      </w:r>
+      <w:hyperlink r:id="rId8" w:history="1">
+        <w:r>
+          <w:rPr>
+            <w:rStyle w:val="Hyperlink"/>
+          </w:rPr>
+          <w:t>URL</w:t>
+        </w:r>
+      </w:hyperlink>
+      <w:r>
+        <w:t>.</w:t>
+      </w:r>
+    </w:p>
     <w:p>
       <w:pPr>
         <w:jc w:val="center"/>
@@ -2932,7 +2942,7 @@
                     <pic:cNvPicPr/>
                   </pic:nvPicPr>
                   <pic:blipFill>
-                    <a:blip r:embed="rId8" cstate="print">
+                    <a:blip r:embed="rId9" cstate="print">
                       <a:extLst>
                         <a:ext uri="{28A0092B-C50C-407E-A947-70E740481C1C}">
                           <a14:useLocalDpi xmlns:a14="http://schemas.microsoft.com/office/drawing/2010/main" val="0"/>
@@ -4329,7 +4339,7 @@
                     <pic:cNvPicPr/>
                   </pic:nvPicPr>
                   <pic:blipFill>
-                    <a:blip r:embed="rId9" cstate="print">
+                    <a:blip r:embed="rId10" cstate="print">
                       <a:extLst>
                         <a:ext uri="{28A0092B-C50C-407E-A947-70E740481C1C}">
                           <a14:useLocalDpi xmlns:a14="http://schemas.microsoft.com/office/drawing/2010/main" val="0"/>
@@ -6145,7 +6155,7 @@
                     <pic:cNvPicPr/>
                   </pic:nvPicPr>
                   <pic:blipFill>
-                    <a:blip r:embed="rId10" cstate="print">
+                    <a:blip r:embed="rId11" cstate="print">
                       <a:extLst>
                         <a:ext uri="{28A0092B-C50C-407E-A947-70E740481C1C}">
                           <a14:useLocalDpi xmlns:a14="http://schemas.microsoft.com/office/drawing/2010/main" val="0"/>
@@ -6266,7 +6276,7 @@
                     <pic:cNvPicPr/>
                   </pic:nvPicPr>
                   <pic:blipFill>
-                    <a:blip r:embed="rId11" cstate="print">
+                    <a:blip r:embed="rId12" cstate="print">
                       <a:extLst>
                         <a:ext uri="{28A0092B-C50C-407E-A947-70E740481C1C}">
                           <a14:useLocalDpi xmlns:a14="http://schemas.microsoft.com/office/drawing/2010/main" val="0"/>
@@ -14938,7 +14948,11 @@
         <w:ilvl w:val="7"/>
         <w:numId w:val="9"/>
       </w:numPr>
+      <w:tabs>
+        <w:tab w:val="num" w:pos="360"/>
+      </w:tabs>
       <w:spacing w:before="40"/>
+      <w:ind w:left="0" w:firstLine="0"/>
       <w:outlineLvl w:val="7"/>
     </w:pPr>
     <w:rPr>
@@ -14965,7 +14979,11 @@
         <w:ilvl w:val="8"/>
         <w:numId w:val="9"/>
       </w:numPr>
+      <w:tabs>
+        <w:tab w:val="num" w:pos="360"/>
+      </w:tabs>
       <w:spacing w:before="40"/>
+      <w:ind w:left="0" w:firstLine="0"/>
       <w:outlineLvl w:val="8"/>
     </w:pPr>
     <w:rPr>

</xml_diff>